<commit_message>
Add LICENSE.md, CHANGELOG.md; wire feedback channel to GitHub Issues
- Top-level LICENSE.md summarizing the EUPL-1.2 / CC-BY-4.0 dual licensing
  (so the license is discoverable on GitHub); REUSE.toml annotates both new files.
- CHANGELOG.md with the v0.1 release notes.
- Specification §13: point reviewers to GitHub Issues and the repo URL;
  DOCX regenerated.

Co-Authored-By: Claude Opus 4.8 <noreply@anthropic.com>
</commit_message>
<xml_diff>
--- a/spec/specifikace.docx
+++ b/spec/specifikace.docx
@@ -36,7 +36,7 @@
         </w:p>
       </w:sdtContent>
     </w:sdt>
-    <w:bookmarkStart w:id="54" w:name="X1269f4b44170dac70236ab0d149f1c4e90a2fe3"/>
+    <w:bookmarkStart w:id="56" w:name="X1269f4b44170dac70236ab0d149f1c4e90a2fe3"/>
     <w:p>
       <w:pPr>
         <w:pStyle w:val="Heading1"/>
@@ -14540,7 +14540,7 @@
       </w:r>
     </w:p>
     <w:bookmarkEnd w:id="45"/>
-    <w:bookmarkStart w:id="46" w:name="jak-připomínkovat"/>
+    <w:bookmarkStart w:id="48" w:name="jak-připomínkovat"/>
     <w:p>
       <w:pPr>
         <w:pStyle w:val="Heading2"/>
@@ -14574,50 +14574,7 @@
         <w:pStyle w:val="BodyText"/>
       </w:pPr>
       <w:r>
-        <w:t xml:space="preserve">Kontakt: David Knespl, Český spolek horologický.</w:t>
-      </w:r>
-      <w:r>
-        <w:t xml:space="preserve"> </w:t>
-      </w:r>
-      <w:r>
-        <w:rPr>
-          <w:i/>
-          <w:iCs/>
-        </w:rPr>
-        <w:t xml:space="preserve">(Doplnit konkrétní kanál — e-mail /</w:t>
-      </w:r>
-      <w:r>
-        <w:rPr>
-          <w:i/>
-          <w:iCs/>
-        </w:rPr>
-        <w:t xml:space="preserve"> </w:t>
-      </w:r>
-      <w:r>
-        <w:rPr>
-          <w:i/>
-          <w:iCs/>
-        </w:rPr>
-        <w:t xml:space="preserve">issue v repozitáři / sdílený dokument podle dohody.)</w:t>
-      </w:r>
-    </w:p>
-    <w:bookmarkEnd w:id="46"/>
-    <w:bookmarkStart w:id="53" w:name="reference"/>
-    <w:p>
-      <w:pPr>
-        <w:pStyle w:val="Heading2"/>
-      </w:pPr>
-      <w:r>
-        <w:t xml:space="preserve">14. Reference</w:t>
-      </w:r>
-    </w:p>
-    <w:bookmarkStart w:id="47" w:name="inspirace-notace-v-jiných-oborech"/>
-    <w:p>
-      <w:pPr>
-        <w:pStyle w:val="Heading3"/>
-      </w:pPr>
-      <w:r>
-        <w:t xml:space="preserve">Inspirace — notace v jiných oborech</w:t>
+        <w:t xml:space="preserve">Kanály pro připomínky:</w:t>
       </w:r>
     </w:p>
     <w:p>
@@ -14629,29 +14586,37 @@
         </w:numPr>
       </w:pPr>
       <w:r>
-        <w:t xml:space="preserve">Weininger, D. (1988):</w:t>
-      </w:r>
-      <w:r>
-        <w:t xml:space="preserve"> </w:t>
-      </w:r>
-      <w:r>
-        <w:rPr>
-          <w:i/>
-          <w:iCs/>
-        </w:rPr>
-        <w:t xml:space="preserve">SMILES, a Chemical Language and Information System.</w:t>
-      </w:r>
-      <w:r>
-        <w:t xml:space="preserve"> </w:t>
-      </w:r>
-      <w:r>
-        <w:t xml:space="preserve">Journal of</w:t>
-      </w:r>
-      <w:r>
-        <w:t xml:space="preserve"> </w:t>
-      </w:r>
-      <w:r>
-        <w:t xml:space="preserve">Chemical Information and Computer Sciences 28(1), 31–36.</w:t>
+        <w:rPr>
+          <w:b/>
+          <w:bCs/>
+        </w:rPr>
+        <w:t xml:space="preserve">GitHub Issues</w:t>
+      </w:r>
+      <w:r>
+        <w:t xml:space="preserve">:</w:t>
+      </w:r>
+      <w:r>
+        <w:t xml:space="preserve"> </w:t>
+      </w:r>
+      <w:hyperlink r:id="rId46">
+        <w:r>
+          <w:rPr>
+            <w:rStyle w:val="Hyperlink"/>
+          </w:rPr>
+          <w:t xml:space="preserve">https://github.com/csh-cz/horonotace/issues</w:t>
+        </w:r>
+      </w:hyperlink>
+      <w:r>
+        <w:t xml:space="preserve"> </w:t>
+      </w:r>
+      <w:r>
+        <w:t xml:space="preserve">(preferováno — u každé</w:t>
+      </w:r>
+      <w:r>
+        <w:t xml:space="preserve"> </w:t>
+      </w:r>
+      <w:r>
+        <w:t xml:space="preserve">připomínky číslo kapitoly),</w:t>
       </w:r>
     </w:p>
     <w:p>
@@ -14663,68 +14628,48 @@
         </w:numPr>
       </w:pPr>
       <w:r>
-        <w:rPr>
-          <w:i/>
-          <w:iCs/>
-        </w:rPr>
-        <w:t xml:space="preserve">Portable Game Notation (PGN)</w:t>
-      </w:r>
-      <w:r>
-        <w:t xml:space="preserve"> </w:t>
-      </w:r>
-      <w:r>
-        <w:t xml:space="preserve">— Edwards, S. J. (1994): Standard specifikace zápisu</w:t>
-      </w:r>
-      <w:r>
-        <w:t xml:space="preserve"> </w:t>
-      </w:r>
-      <w:r>
-        <w:t xml:space="preserve">šachových partií.</w:t>
+        <w:t xml:space="preserve">kontakt: David Knespl, Český spolek horologický.</w:t>
       </w:r>
     </w:p>
     <w:p>
       <w:pPr>
-        <w:pStyle w:val="Compact"/>
-        <w:numPr>
-          <w:ilvl w:val="0"/>
-          <w:numId w:val="1011"/>
-        </w:numPr>
-      </w:pPr>
-      <w:r>
-        <w:rPr>
-          <w:i/>
-          <w:iCs/>
-        </w:rPr>
-        <w:t xml:space="preserve">Music Encoding Initiative (MEI)</w:t>
-      </w:r>
-      <w:r>
-        <w:t xml:space="preserve">, music-encoding.org;</w:t>
-      </w:r>
-      <w:r>
-        <w:t xml:space="preserve"> </w:t>
-      </w:r>
-      <w:r>
-        <w:rPr>
-          <w:i/>
-          <w:iCs/>
-        </w:rPr>
-        <w:t xml:space="preserve">ABC notation</w:t>
-      </w:r>
-      <w:r>
-        <w:t xml:space="preserve"> </w:t>
-      </w:r>
-      <w:r>
-        <w:t xml:space="preserve">(Chris Walshaw).</w:t>
+        <w:pStyle w:val="FirstParagraph"/>
+      </w:pPr>
+      <w:r>
+        <w:t xml:space="preserve">Zdrojový repozitář (model, schéma, příklady, renderery):</w:t>
+      </w:r>
+      <w:r>
+        <w:t xml:space="preserve"> </w:t>
+      </w:r>
+      <w:hyperlink r:id="rId47">
+        <w:r>
+          <w:rPr>
+            <w:rStyle w:val="Hyperlink"/>
+          </w:rPr>
+          <w:t xml:space="preserve">https://github.com/csh-cz/horonotace</w:t>
+        </w:r>
+      </w:hyperlink>
+      <w:r>
+        <w:t xml:space="preserve">.</w:t>
       </w:r>
     </w:p>
-    <w:bookmarkEnd w:id="47"/>
-    <w:bookmarkStart w:id="48" w:name="strojní-kinematická-schémata-klasické"/>
+    <w:bookmarkEnd w:id="48"/>
+    <w:bookmarkStart w:id="55" w:name="reference"/>
     <w:p>
       <w:pPr>
+        <w:pStyle w:val="Heading2"/>
+      </w:pPr>
+      <w:r>
+        <w:t xml:space="preserve">14. Reference</w:t>
+      </w:r>
+    </w:p>
+    <w:bookmarkStart w:id="49" w:name="inspirace-notace-v-jiných-oborech"/>
+    <w:p>
+      <w:pPr>
         <w:pStyle w:val="Heading3"/>
       </w:pPr>
       <w:r>
-        <w:t xml:space="preserve">Strojní kinematická schémata (klasické)</w:t>
+        <w:t xml:space="preserve">Inspirace — notace v jiných oborech</w:t>
       </w:r>
     </w:p>
     <w:p>
@@ -14736,14 +14681,7 @@
         </w:numPr>
       </w:pPr>
       <w:r>
-        <w:rPr>
-          <w:b/>
-          <w:bCs/>
-        </w:rPr>
-        <w:t xml:space="preserve">ISO 3952-1 až -4</w:t>
-      </w:r>
-      <w:r>
-        <w:t xml:space="preserve">:</w:t>
+        <w:t xml:space="preserve">Weininger, D. (1988):</w:t>
       </w:r>
       <w:r>
         <w:t xml:space="preserve"> </w:t>
@@ -14753,19 +14691,19 @@
           <w:i/>
           <w:iCs/>
         </w:rPr>
-        <w:t xml:space="preserve">Kinematic diagrams — Graphical symbols</w:t>
-      </w:r>
-      <w:r>
-        <w:t xml:space="preserve"> </w:t>
-      </w:r>
-      <w:r>
-        <w:t xml:space="preserve">(1. vyd. 1981).</w:t>
-      </w:r>
-      <w:r>
-        <w:t xml:space="preserve"> </w:t>
-      </w:r>
-      <w:r>
-        <w:t xml:space="preserve">Mezinárodní norma grafických značek pro kinematická schémata mechanismů.</w:t>
+        <w:t xml:space="preserve">SMILES, a Chemical Language and Information System.</w:t>
+      </w:r>
+      <w:r>
+        <w:t xml:space="preserve"> </w:t>
+      </w:r>
+      <w:r>
+        <w:t xml:space="preserve">Journal of</w:t>
+      </w:r>
+      <w:r>
+        <w:t xml:space="preserve"> </w:t>
+      </w:r>
+      <w:r>
+        <w:t xml:space="preserve">Chemical Information and Computer Sciences 28(1), 31–36.</w:t>
       </w:r>
     </w:p>
     <w:p>
@@ -14777,37 +14715,23 @@
         </w:numPr>
       </w:pPr>
       <w:r>
-        <w:t xml:space="preserve">Reuleaux, F. (1875):</w:t>
-      </w:r>
-      <w:r>
-        <w:t xml:space="preserve"> </w:t>
-      </w:r>
-      <w:r>
         <w:rPr>
           <w:i/>
           <w:iCs/>
         </w:rPr>
-        <w:t xml:space="preserve">Theoretische Kinematik. Grundzüge einer Theorie des</w:t>
-      </w:r>
-      <w:r>
-        <w:rPr>
-          <w:i/>
-          <w:iCs/>
-        </w:rPr>
-        <w:t xml:space="preserve"> </w:t>
-      </w:r>
-      <w:r>
-        <w:rPr>
-          <w:i/>
-          <w:iCs/>
-        </w:rPr>
-        <w:t xml:space="preserve">Maschinenwesens.</w:t>
-      </w:r>
-      <w:r>
-        <w:t xml:space="preserve"> </w:t>
-      </w:r>
-      <w:r>
-        <w:t xml:space="preserve">Vieweg, Braunschweig.</w:t>
+        <w:t xml:space="preserve">Portable Game Notation (PGN)</w:t>
+      </w:r>
+      <w:r>
+        <w:t xml:space="preserve"> </w:t>
+      </w:r>
+      <w:r>
+        <w:t xml:space="preserve">— Edwards, S. J. (1994): Standard specifikace zápisu</w:t>
+      </w:r>
+      <w:r>
+        <w:t xml:space="preserve"> </w:t>
+      </w:r>
+      <w:r>
+        <w:t xml:space="preserve">šachových partií.</w:t>
       </w:r>
     </w:p>
     <w:p>
@@ -14819,39 +14743,40 @@
         </w:numPr>
       </w:pPr>
       <w:r>
-        <w:t xml:space="preserve">Artoboleckij, I. I. (1975–1980):</w:t>
-      </w:r>
-      <w:r>
-        <w:t xml:space="preserve"> </w:t>
-      </w:r>
-      <w:r>
         <w:rPr>
           <w:i/>
           <w:iCs/>
         </w:rPr>
-        <w:t xml:space="preserve">Mechanisms in Modern Engineering Design.</w:t>
-      </w:r>
-      <w:r>
-        <w:t xml:space="preserve"> </w:t>
-      </w:r>
-      <w:r>
-        <w:t xml:space="preserve">Mir,</w:t>
-      </w:r>
-      <w:r>
-        <w:t xml:space="preserve"> </w:t>
-      </w:r>
-      <w:r>
-        <w:t xml:space="preserve">Moskva (katalog kinematických schémat mechanismů).</w:t>
+        <w:t xml:space="preserve">Music Encoding Initiative (MEI)</w:t>
+      </w:r>
+      <w:r>
+        <w:t xml:space="preserve">, music-encoding.org;</w:t>
+      </w:r>
+      <w:r>
+        <w:t xml:space="preserve"> </w:t>
+      </w:r>
+      <w:r>
+        <w:rPr>
+          <w:i/>
+          <w:iCs/>
+        </w:rPr>
+        <w:t xml:space="preserve">ABC notation</w:t>
+      </w:r>
+      <w:r>
+        <w:t xml:space="preserve"> </w:t>
+      </w:r>
+      <w:r>
+        <w:t xml:space="preserve">(Chris Walshaw).</w:t>
       </w:r>
     </w:p>
-    <w:bookmarkEnd w:id="48"/>
-    <w:bookmarkStart w:id="49" w:name="X973bd5fed86db00043664c560f0dd37bc42235c"/>
+    <w:bookmarkEnd w:id="49"/>
+    <w:bookmarkStart w:id="50" w:name="strojní-kinematická-schémata-klasické"/>
     <w:p>
       <w:pPr>
         <w:pStyle w:val="Heading3"/>
       </w:pPr>
       <w:r>
-        <w:t xml:space="preserve">Grafická elevace soukolí — hlavní inspirace</w:t>
+        <w:t xml:space="preserve">Strojní kinematická schémata (klasické)</w:t>
       </w:r>
     </w:p>
     <w:p>
@@ -14867,69 +14792,118 @@
           <w:b/>
           <w:bCs/>
         </w:rPr>
-        <w:t xml:space="preserve">Oechslin, L. (1996):</w:t>
-      </w:r>
-      <w:r>
-        <w:rPr>
-          <w:b/>
-          <w:bCs/>
-        </w:rPr>
-        <w:t xml:space="preserve"> </w:t>
-      </w:r>
-      <w:r>
-        <w:rPr>
-          <w:b/>
-          <w:bCs/>
+        <w:t xml:space="preserve">ISO 3952-1 až -4</w:t>
+      </w:r>
+      <w:r>
+        <w:t xml:space="preserve">:</w:t>
+      </w:r>
+      <w:r>
+        <w:t xml:space="preserve"> </w:t>
+      </w:r>
+      <w:r>
+        <w:rPr>
           <w:i/>
           <w:iCs/>
         </w:rPr>
-        <w:t xml:space="preserve">Astronomische Uhren und Welt-Modelle der Priestermechaniker</w:t>
-      </w:r>
-      <w:r>
-        <w:rPr>
-          <w:b/>
-          <w:bCs/>
+        <w:t xml:space="preserve">Kinematic diagrams — Graphical symbols</w:t>
+      </w:r>
+      <w:r>
+        <w:t xml:space="preserve"> </w:t>
+      </w:r>
+      <w:r>
+        <w:t xml:space="preserve">(1. vyd. 1981).</w:t>
+      </w:r>
+      <w:r>
+        <w:t xml:space="preserve"> </w:t>
+      </w:r>
+      <w:r>
+        <w:t xml:space="preserve">Mezinárodní norma grafických značek pro kinematická schémata mechanismů.</w:t>
+      </w:r>
+    </w:p>
+    <w:p>
+      <w:pPr>
+        <w:pStyle w:val="Compact"/>
+        <w:numPr>
+          <w:ilvl w:val="0"/>
+          <w:numId w:val="1013"/>
+        </w:numPr>
+      </w:pPr>
+      <w:r>
+        <w:t xml:space="preserve">Reuleaux, F. (1875):</w:t>
+      </w:r>
+      <w:r>
+        <w:t xml:space="preserve"> </w:t>
+      </w:r>
+      <w:r>
+        <w:rPr>
           <w:i/>
           <w:iCs/>
         </w:rPr>
-        <w:t xml:space="preserve"> </w:t>
-      </w:r>
-      <w:r>
-        <w:rPr>
-          <w:b/>
-          <w:bCs/>
+        <w:t xml:space="preserve">Theoretische Kinematik. Grundzüge einer Theorie des</w:t>
+      </w:r>
+      <w:r>
+        <w:rPr>
           <w:i/>
           <w:iCs/>
         </w:rPr>
-        <w:t xml:space="preserve">im 18. Jahrhundert.</w:t>
-      </w:r>
-      <w:r>
-        <w:t xml:space="preserve"> </w:t>
-      </w:r>
-      <w:r>
-        <w:t xml:space="preserve">— vzor „elevace mezi deskami” (svislice = hřídel, závorka =</w:t>
-      </w:r>
-      <w:r>
-        <w:t xml:space="preserve"> </w:t>
-      </w:r>
-      <w:r>
-        <w:t xml:space="preserve">kolo se zuby, vodorovně = záběr, pojmenované výstupy = indikace). Hlavní inspirace pro</w:t>
-      </w:r>
-      <w:r>
-        <w:t xml:space="preserve"> </w:t>
-      </w:r>
-      <w:r>
-        <w:t xml:space="preserve">vrstvu C. Interní rozbor: docs/oechslin-roegel.md.</w:t>
+        <w:t xml:space="preserve"> </w:t>
+      </w:r>
+      <w:r>
+        <w:rPr>
+          <w:i/>
+          <w:iCs/>
+        </w:rPr>
+        <w:t xml:space="preserve">Maschinenwesens.</w:t>
+      </w:r>
+      <w:r>
+        <w:t xml:space="preserve"> </w:t>
+      </w:r>
+      <w:r>
+        <w:t xml:space="preserve">Vieweg, Braunschweig.</w:t>
       </w:r>
     </w:p>
-    <w:bookmarkEnd w:id="49"/>
-    <w:bookmarkStart w:id="50" w:name="X205d5ea31cd792d418ee7fa8c98467921007a09"/>
     <w:p>
       <w:pPr>
+        <w:pStyle w:val="Compact"/>
+        <w:numPr>
+          <w:ilvl w:val="0"/>
+          <w:numId w:val="1013"/>
+        </w:numPr>
+      </w:pPr>
+      <w:r>
+        <w:t xml:space="preserve">Artoboleckij, I. I. (1975–1980):</w:t>
+      </w:r>
+      <w:r>
+        <w:t xml:space="preserve"> </w:t>
+      </w:r>
+      <w:r>
+        <w:rPr>
+          <w:i/>
+          <w:iCs/>
+        </w:rPr>
+        <w:t xml:space="preserve">Mechanisms in Modern Engineering Design.</w:t>
+      </w:r>
+      <w:r>
+        <w:t xml:space="preserve"> </w:t>
+      </w:r>
+      <w:r>
+        <w:t xml:space="preserve">Mir,</w:t>
+      </w:r>
+      <w:r>
+        <w:t xml:space="preserve"> </w:t>
+      </w:r>
+      <w:r>
+        <w:t xml:space="preserve">Moskva (katalog kinematických schémat mechanismů).</w:t>
+      </w:r>
+    </w:p>
+    <w:bookmarkEnd w:id="50"/>
+    <w:bookmarkStart w:id="51" w:name="X973bd5fed86db00043664c560f0dd37bc42235c"/>
+    <w:p>
+      <w:pPr>
         <w:pStyle w:val="Heading3"/>
       </w:pPr>
       <w:r>
-        <w:t xml:space="preserve">Horologická terminologie a konstrukce (česká a německá)</w:t>
+        <w:t xml:space="preserve">Grafická elevace soukolí — hlavní inspirace</w:t>
       </w:r>
     </w:p>
     <w:p>
@@ -14941,191 +14915,73 @@
         </w:numPr>
       </w:pPr>
       <w:r>
-        <w:t xml:space="preserve">Špatný, F. (1882):</w:t>
-      </w:r>
-      <w:r>
-        <w:t xml:space="preserve"> </w:t>
-      </w:r>
-      <w:r>
-        <w:rPr>
+        <w:rPr>
+          <w:b/>
+          <w:bCs/>
+        </w:rPr>
+        <w:t xml:space="preserve">Oechslin, L. (1996):</w:t>
+      </w:r>
+      <w:r>
+        <w:rPr>
+          <w:b/>
+          <w:bCs/>
+        </w:rPr>
+        <w:t xml:space="preserve"> </w:t>
+      </w:r>
+      <w:r>
+        <w:rPr>
+          <w:b/>
+          <w:bCs/>
           <w:i/>
           <w:iCs/>
         </w:rPr>
-        <w:t xml:space="preserve">Německo-český slovník pro hodináře a pouzdráře hodinářské.</w:t>
-      </w:r>
-      <w:r>
-        <w:t xml:space="preserve"> </w:t>
-      </w:r>
-      <w:r>
-        <w:t xml:space="preserve">(digitální kopie MZK)</w:t>
-      </w:r>
-    </w:p>
-    <w:p>
-      <w:pPr>
-        <w:pStyle w:val="Compact"/>
-        <w:numPr>
-          <w:ilvl w:val="0"/>
-          <w:numId w:val="1014"/>
-        </w:numPr>
-      </w:pPr>
-      <w:r>
-        <w:t xml:space="preserve">Sušický, V. R. (1900):</w:t>
-      </w:r>
-      <w:r>
-        <w:t xml:space="preserve"> </w:t>
-      </w:r>
-      <w:r>
-        <w:rPr>
+        <w:t xml:space="preserve">Astronomische Uhren und Welt-Modelle der Priestermechaniker</w:t>
+      </w:r>
+      <w:r>
+        <w:rPr>
+          <w:b/>
+          <w:bCs/>
           <w:i/>
           <w:iCs/>
         </w:rPr>
-        <w:t xml:space="preserve">Hodinářství. Pro praktickou potřebu hodinářů a škol odborných.</w:t>
-      </w:r>
-    </w:p>
-    <w:p>
-      <w:pPr>
-        <w:pStyle w:val="Compact"/>
-        <w:numPr>
-          <w:ilvl w:val="0"/>
-          <w:numId w:val="1014"/>
-        </w:numPr>
-      </w:pPr>
-      <w:r>
-        <w:t xml:space="preserve">Sladkovský, J. (1947):</w:t>
-      </w:r>
-      <w:r>
-        <w:t xml:space="preserve"> </w:t>
-      </w:r>
-      <w:r>
-        <w:rPr>
+        <w:t xml:space="preserve"> </w:t>
+      </w:r>
+      <w:r>
+        <w:rPr>
+          <w:b/>
+          <w:bCs/>
           <w:i/>
           <w:iCs/>
         </w:rPr>
-        <w:t xml:space="preserve">Učebnice odborné nauky hodinářské.</w:t>
-      </w:r>
-      <w:r>
-        <w:t xml:space="preserve"> </w:t>
-      </w:r>
-      <w:r>
-        <w:t xml:space="preserve">(zejm. bicí soukolí)</w:t>
+        <w:t xml:space="preserve">im 18. Jahrhundert.</w:t>
+      </w:r>
+      <w:r>
+        <w:t xml:space="preserve"> </w:t>
+      </w:r>
+      <w:r>
+        <w:t xml:space="preserve">— vzor „elevace mezi deskami” (svislice = hřídel, závorka =</w:t>
+      </w:r>
+      <w:r>
+        <w:t xml:space="preserve"> </w:t>
+      </w:r>
+      <w:r>
+        <w:t xml:space="preserve">kolo se zuby, vodorovně = záběr, pojmenované výstupy = indikace). Hlavní inspirace pro</w:t>
+      </w:r>
+      <w:r>
+        <w:t xml:space="preserve"> </w:t>
+      </w:r>
+      <w:r>
+        <w:t xml:space="preserve">vrstvu C. Interní rozbor: docs/oechslin-roegel.md.</w:t>
       </w:r>
     </w:p>
+    <w:bookmarkEnd w:id="51"/>
+    <w:bookmarkStart w:id="52" w:name="X205d5ea31cd792d418ee7fa8c98467921007a09"/>
     <w:p>
       <w:pPr>
-        <w:pStyle w:val="Compact"/>
-        <w:numPr>
-          <w:ilvl w:val="0"/>
-          <w:numId w:val="1014"/>
-        </w:numPr>
-      </w:pPr>
-      <w:r>
-        <w:t xml:space="preserve">Hajn, M. (1953):</w:t>
-      </w:r>
-      <w:r>
-        <w:t xml:space="preserve"> </w:t>
-      </w:r>
-      <w:r>
-        <w:rPr>
-          <w:i/>
-          <w:iCs/>
-        </w:rPr>
-        <w:t xml:space="preserve">Základy jemné mechaniky a hodinářství.</w:t>
-      </w:r>
-    </w:p>
-    <w:p>
-      <w:pPr>
-        <w:pStyle w:val="Compact"/>
-        <w:numPr>
-          <w:ilvl w:val="0"/>
-          <w:numId w:val="1014"/>
-        </w:numPr>
-      </w:pPr>
-      <w:r>
-        <w:t xml:space="preserve">Martínek, Z. &amp; Řehoř, J. (1964):</w:t>
-      </w:r>
-      <w:r>
-        <w:t xml:space="preserve"> </w:t>
-      </w:r>
-      <w:r>
-        <w:rPr>
-          <w:i/>
-          <w:iCs/>
-        </w:rPr>
-        <w:t xml:space="preserve">Základy hodinářství.</w:t>
-      </w:r>
-      <w:r>
-        <w:t xml:space="preserve"> </w:t>
-      </w:r>
-      <w:r>
-        <w:t xml:space="preserve">(vzor blokové granularity)</w:t>
-      </w:r>
-    </w:p>
-    <w:p>
-      <w:pPr>
-        <w:pStyle w:val="Compact"/>
-        <w:numPr>
-          <w:ilvl w:val="0"/>
-          <w:numId w:val="1014"/>
-        </w:numPr>
-      </w:pPr>
-      <w:r>
-        <w:t xml:space="preserve">Dietzschold, C. (1905):</w:t>
-      </w:r>
-      <w:r>
-        <w:t xml:space="preserve"> </w:t>
-      </w:r>
-      <w:r>
-        <w:rPr>
-          <w:i/>
-          <w:iCs/>
-        </w:rPr>
-        <w:t xml:space="preserve">Die Hemmungen der Uhren.</w:t>
-      </w:r>
-      <w:r>
-        <w:t xml:space="preserve"> </w:t>
-      </w:r>
-      <w:r>
-        <w:t xml:space="preserve">archive.org (kroky / Hemmungen)</w:t>
-      </w:r>
-    </w:p>
-    <w:p>
-      <w:pPr>
-        <w:pStyle w:val="Compact"/>
-        <w:numPr>
-          <w:ilvl w:val="0"/>
-          <w:numId w:val="1014"/>
-        </w:numPr>
-      </w:pPr>
-      <w:r>
-        <w:t xml:space="preserve">Další period prameny v glosáři skillu</w:t>
-      </w:r>
-      <w:r>
-        <w:t xml:space="preserve"> </w:t>
-      </w:r>
-      <w:r>
-        <w:rPr>
-          <w:rStyle w:val="VerbatimChar"/>
-        </w:rPr>
-        <w:t xml:space="preserve">horologicka-terminologie</w:t>
-      </w:r>
-      <w:r>
-        <w:t xml:space="preserve">: Saunier (1887),</w:t>
-      </w:r>
-      <w:r>
-        <w:t xml:space="preserve"> </w:t>
-      </w:r>
-      <w:r>
-        <w:t xml:space="preserve">Gros (1913), Šumavský (1851).</w:t>
-      </w:r>
-    </w:p>
-    <w:bookmarkEnd w:id="50"/>
-    <w:bookmarkStart w:id="51" w:name="pražský-orloj-příklad-10"/>
-    <w:p>
-      <w:pPr>
         <w:pStyle w:val="Heading3"/>
       </w:pPr>
       <w:r>
-        <w:t xml:space="preserve">Pražský orloj (příklad §10)</w:t>
+        <w:t xml:space="preserve">Horologická terminologie a konstrukce (česká a německá)</w:t>
       </w:r>
     </w:p>
     <w:p>
@@ -15137,7 +14993,7 @@
         </w:numPr>
       </w:pPr>
       <w:r>
-        <w:t xml:space="preserve">Horský, Z. &amp; Procházka, E. (1964):</w:t>
+        <w:t xml:space="preserve">Špatný, F. (1882):</w:t>
       </w:r>
       <w:r>
         <w:t xml:space="preserve"> </w:t>
@@ -15147,13 +15003,13 @@
           <w:i/>
           <w:iCs/>
         </w:rPr>
-        <w:t xml:space="preserve">Pražský orloj</w:t>
-      </w:r>
-      <w:r>
-        <w:t xml:space="preserve"> </w:t>
-      </w:r>
-      <w:r>
-        <w:t xml:space="preserve">(počty zubů astrolábu).</w:t>
+        <w:t xml:space="preserve">Německo-český slovník pro hodináře a pouzdráře hodinářské.</w:t>
+      </w:r>
+      <w:r>
+        <w:t xml:space="preserve"> </w:t>
+      </w:r>
+      <w:r>
+        <w:t xml:space="preserve">(digitální kopie MZK)</w:t>
       </w:r>
     </w:p>
     <w:p>
@@ -15165,17 +15021,163 @@
         </w:numPr>
       </w:pPr>
       <w:r>
-        <w:t xml:space="preserve">orloj.eu — popis soukolí a indikací.</w:t>
+        <w:t xml:space="preserve">Sušický, V. R. (1900):</w:t>
+      </w:r>
+      <w:r>
+        <w:t xml:space="preserve"> </w:t>
+      </w:r>
+      <w:r>
+        <w:rPr>
+          <w:i/>
+          <w:iCs/>
+        </w:rPr>
+        <w:t xml:space="preserve">Hodinářství. Pro praktickou potřebu hodinářů a škol odborných.</w:t>
       </w:r>
     </w:p>
-    <w:bookmarkEnd w:id="51"/>
-    <w:bookmarkStart w:id="52" w:name="metadatové-standardy-plán-v0.2"/>
     <w:p>
       <w:pPr>
+        <w:pStyle w:val="Compact"/>
+        <w:numPr>
+          <w:ilvl w:val="0"/>
+          <w:numId w:val="1015"/>
+        </w:numPr>
+      </w:pPr>
+      <w:r>
+        <w:t xml:space="preserve">Sladkovský, J. (1947):</w:t>
+      </w:r>
+      <w:r>
+        <w:t xml:space="preserve"> </w:t>
+      </w:r>
+      <w:r>
+        <w:rPr>
+          <w:i/>
+          <w:iCs/>
+        </w:rPr>
+        <w:t xml:space="preserve">Učebnice odborné nauky hodinářské.</w:t>
+      </w:r>
+      <w:r>
+        <w:t xml:space="preserve"> </w:t>
+      </w:r>
+      <w:r>
+        <w:t xml:space="preserve">(zejm. bicí soukolí)</w:t>
+      </w:r>
+    </w:p>
+    <w:p>
+      <w:pPr>
+        <w:pStyle w:val="Compact"/>
+        <w:numPr>
+          <w:ilvl w:val="0"/>
+          <w:numId w:val="1015"/>
+        </w:numPr>
+      </w:pPr>
+      <w:r>
+        <w:t xml:space="preserve">Hajn, M. (1953):</w:t>
+      </w:r>
+      <w:r>
+        <w:t xml:space="preserve"> </w:t>
+      </w:r>
+      <w:r>
+        <w:rPr>
+          <w:i/>
+          <w:iCs/>
+        </w:rPr>
+        <w:t xml:space="preserve">Základy jemné mechaniky a hodinářství.</w:t>
+      </w:r>
+    </w:p>
+    <w:p>
+      <w:pPr>
+        <w:pStyle w:val="Compact"/>
+        <w:numPr>
+          <w:ilvl w:val="0"/>
+          <w:numId w:val="1015"/>
+        </w:numPr>
+      </w:pPr>
+      <w:r>
+        <w:t xml:space="preserve">Martínek, Z. &amp; Řehoř, J. (1964):</w:t>
+      </w:r>
+      <w:r>
+        <w:t xml:space="preserve"> </w:t>
+      </w:r>
+      <w:r>
+        <w:rPr>
+          <w:i/>
+          <w:iCs/>
+        </w:rPr>
+        <w:t xml:space="preserve">Základy hodinářství.</w:t>
+      </w:r>
+      <w:r>
+        <w:t xml:space="preserve"> </w:t>
+      </w:r>
+      <w:r>
+        <w:t xml:space="preserve">(vzor blokové granularity)</w:t>
+      </w:r>
+    </w:p>
+    <w:p>
+      <w:pPr>
+        <w:pStyle w:val="Compact"/>
+        <w:numPr>
+          <w:ilvl w:val="0"/>
+          <w:numId w:val="1015"/>
+        </w:numPr>
+      </w:pPr>
+      <w:r>
+        <w:t xml:space="preserve">Dietzschold, C. (1905):</w:t>
+      </w:r>
+      <w:r>
+        <w:t xml:space="preserve"> </w:t>
+      </w:r>
+      <w:r>
+        <w:rPr>
+          <w:i/>
+          <w:iCs/>
+        </w:rPr>
+        <w:t xml:space="preserve">Die Hemmungen der Uhren.</w:t>
+      </w:r>
+      <w:r>
+        <w:t xml:space="preserve"> </w:t>
+      </w:r>
+      <w:r>
+        <w:t xml:space="preserve">archive.org (kroky / Hemmungen)</w:t>
+      </w:r>
+    </w:p>
+    <w:p>
+      <w:pPr>
+        <w:pStyle w:val="Compact"/>
+        <w:numPr>
+          <w:ilvl w:val="0"/>
+          <w:numId w:val="1015"/>
+        </w:numPr>
+      </w:pPr>
+      <w:r>
+        <w:t xml:space="preserve">Další period prameny v glosáři skillu</w:t>
+      </w:r>
+      <w:r>
+        <w:t xml:space="preserve"> </w:t>
+      </w:r>
+      <w:r>
+        <w:rPr>
+          <w:rStyle w:val="VerbatimChar"/>
+        </w:rPr>
+        <w:t xml:space="preserve">horologicka-terminologie</w:t>
+      </w:r>
+      <w:r>
+        <w:t xml:space="preserve">: Saunier (1887),</w:t>
+      </w:r>
+      <w:r>
+        <w:t xml:space="preserve"> </w:t>
+      </w:r>
+      <w:r>
+        <w:t xml:space="preserve">Gros (1913), Šumavský (1851).</w:t>
+      </w:r>
+    </w:p>
+    <w:bookmarkEnd w:id="52"/>
+    <w:bookmarkStart w:id="53" w:name="pražský-orloj-příklad-10"/>
+    <w:p>
+      <w:pPr>
         <w:pStyle w:val="Heading3"/>
       </w:pPr>
       <w:r>
-        <w:t xml:space="preserve">Metadatové standardy (plán, v0.2)</w:t>
+        <w:t xml:space="preserve">Pražský orloj (příklad §10)</w:t>
       </w:r>
     </w:p>
     <w:p>
@@ -15187,6 +15189,56 @@
         </w:numPr>
       </w:pPr>
       <w:r>
+        <w:t xml:space="preserve">Horský, Z. &amp; Procházka, E. (1964):</w:t>
+      </w:r>
+      <w:r>
+        <w:t xml:space="preserve"> </w:t>
+      </w:r>
+      <w:r>
+        <w:rPr>
+          <w:i/>
+          <w:iCs/>
+        </w:rPr>
+        <w:t xml:space="preserve">Pražský orloj</w:t>
+      </w:r>
+      <w:r>
+        <w:t xml:space="preserve"> </w:t>
+      </w:r>
+      <w:r>
+        <w:t xml:space="preserve">(počty zubů astrolábu).</w:t>
+      </w:r>
+    </w:p>
+    <w:p>
+      <w:pPr>
+        <w:pStyle w:val="Compact"/>
+        <w:numPr>
+          <w:ilvl w:val="0"/>
+          <w:numId w:val="1016"/>
+        </w:numPr>
+      </w:pPr>
+      <w:r>
+        <w:t xml:space="preserve">orloj.eu — popis soukolí a indikací.</w:t>
+      </w:r>
+    </w:p>
+    <w:bookmarkEnd w:id="53"/>
+    <w:bookmarkStart w:id="54" w:name="metadatové-standardy-plán-v0.2"/>
+    <w:p>
+      <w:pPr>
+        <w:pStyle w:val="Heading3"/>
+      </w:pPr>
+      <w:r>
+        <w:t xml:space="preserve">Metadatové standardy (plán, v0.2)</w:t>
+      </w:r>
+    </w:p>
+    <w:p>
+      <w:pPr>
+        <w:pStyle w:val="Compact"/>
+        <w:numPr>
+          <w:ilvl w:val="0"/>
+          <w:numId w:val="1017"/>
+        </w:numPr>
+      </w:pPr>
+      <w:r>
         <w:t xml:space="preserve">Getty AAT (Art &amp; Architecture Thesaurus), Wikidata, CIDOC-CRM — mapování slovníku a</w:t>
       </w:r>
       <w:r>
@@ -15229,9 +15281,9 @@
         <w:t xml:space="preserve">za čas věnovaný oponentuře.</w:t>
       </w:r>
     </w:p>
-    <w:bookmarkEnd w:id="52"/>
-    <w:bookmarkEnd w:id="53"/>
     <w:bookmarkEnd w:id="54"/>
+    <w:bookmarkEnd w:id="55"/>
+    <w:bookmarkEnd w:id="56"/>
     <w:sectPr>
       <w:footnotePr>
         <w:numRestart w:val="eachSect"/>
@@ -15633,6 +15685,9 @@
     <w:abstractNumId w:val="991"/>
   </w:num>
   <w:num w:numId="1016">
+    <w:abstractNumId w:val="991"/>
+  </w:num>
+  <w:num w:numId="1017">
     <w:abstractNumId w:val="991"/>
   </w:num>
 </w:numbering>

</xml_diff>